<commit_message>
Fix DOCX extraction: section bodies, graph summary; expand registry gaps
Co-authored-by: Demid369 <Demid369@users.noreply.github.com>
</commit_message>
<xml_diff>
--- a/docs/inventory/krolikovodstvo/docx/T01-finance.docx
+++ b/docs/inventory/krolikovodstvo/docx/T01-finance.docx
@@ -76,7 +76,7 @@
           <w:color w:val="1A568E"/>
           <w:sz w:val="18"/>
         </w:rPr>
-        <w:t>↳ docs/graphify-corpus/00-summary.md:13–19</w:t>
+        <w:t>↳ docs/graphify-corpus/00-summary.md:13–20</w:t>
       </w:r>
     </w:p>
     <w:p>
@@ -86,7 +86,7 @@
           <w:color w:val="1A568E"/>
           <w:sz w:val="18"/>
         </w:rPr>
-        <w:t>↳ docs/graphify-corpus/00-summary.md:25–30</w:t>
+        <w:t>↳ docs/graphify-corpus/00-summary.md:25–31</w:t>
       </w:r>
     </w:p>
     <w:p>
@@ -96,7 +96,7 @@
           <w:color w:val="1A568E"/>
           <w:sz w:val="18"/>
         </w:rPr>
-        <w:t>↳ docs/graphify-corpus/00-summary.md:33–38</w:t>
+        <w:t>↳ docs/graphify-corpus/00-summary.md:33–39</w:t>
       </w:r>
     </w:p>
     <w:p>
@@ -104,7 +104,7 @@
         <w:pStyle w:val="Heading3"/>
       </w:pPr>
       <w:r>
-        <w:t>Фрагмент docs/graphify-corpus/00-summary.md:13–19</w:t>
+        <w:t>Фрагмент docs/graphify-corpus/00-summary.md:13–20</w:t>
       </w:r>
     </w:p>
     <w:p>
@@ -137,7 +137,7 @@
         <w:pStyle w:val="Heading3"/>
       </w:pPr>
       <w:r>
-        <w:t>Фрагмент docs/graphify-corpus/00-summary.md:25–30</w:t>
+        <w:t>Фрагмент docs/graphify-corpus/00-summary.md:25–31</w:t>
       </w:r>
     </w:p>
     <w:p>
@@ -168,7 +168,7 @@
         <w:pStyle w:val="Heading3"/>
       </w:pPr>
       <w:r>
-        <w:t>Фрагмент docs/graphify-corpus/00-summary.md:33–38</w:t>
+        <w:t>Фрагмент docs/graphify-corpus/00-summary.md:33–39</w:t>
       </w:r>
     </w:p>
     <w:p>

</xml_diff>